<commit_message>
#261020 fix: fixed global settings
</commit_message>
<xml_diff>
--- a/files/komite-formu.docx
+++ b/files/komite-formu.docx
@@ -2179,7 +2179,7 @@
     </w:p>
     <w:tbl>
       <w:tblPr>
-        <w:tblW w:w="6651" w:type="dxa"/>
+        <w:tblW w:w="9902" w:type="dxa"/>
         <w:tblBorders>
           <w:top w:val="single" w:sz="4" w:space="0" w:color="auto"/>
           <w:left w:val="single" w:sz="4" w:space="0" w:color="auto"/>
@@ -2198,770 +2198,852 @@
       <w:tblGrid>
         <w:gridCol w:w="2835"/>
         <w:gridCol w:w="2127"/>
-        <w:gridCol w:w="260"/>
-        <w:gridCol w:w="1429"/>
+        <w:gridCol w:w="1689"/>
+        <w:gridCol w:w="862"/>
+        <w:gridCol w:w="2389"/>
       </w:tblGrid>
+      <w:tr>
+        <w:trPr>
+          <w:gridAfter w:val="2"/>
+          <w:wAfter w:w="3251" w:type="dxa"/>
+          <w:trHeight w:val="55"/>
+        </w:trPr>
+        <w:tc>
+          <w:tcPr>
+            <w:tcW w:w="6651" w:type="dxa"/>
+            <w:gridSpan w:val="3"/>
+            <w:tcBorders>
+              <w:top w:val="none" w:sz="0" w:space="0" w:color="FFFFFF"/>
+              <w:left w:val="none" w:sz="0" w:space="0" w:color="FFFFFF"/>
+              <w:bottom w:val="none" w:sz="0" w:space="0" w:color="FFFFFF"/>
+              <w:right w:val="none" w:sz="0" w:space="0" w:color="FFFFFF"/>
+            </w:tcBorders>
+            <w:tcMar>
+              <w:top w:w="80" w:type="dxa"/>
+              <w:left w:w="120" w:type="dxa"/>
+              <w:bottom w:w="80" w:type="dxa"/>
+              <w:right w:w="120" w:type="dxa"/>
+            </w:tcMar>
+            <w:vAlign w:val="center"/>
+          </w:tcPr>
+          <w:p>
+            <w:pPr>
+              <w:rPr>
+                <w:sz w:val="16"/>
+                <w:szCs w:val="16"/>
+              </w:rPr>
+            </w:pPr>
+            <w:r>
+              <w:rPr>
+                <w:b/>
+                <w:bCs/>
+                <w:color w:val="FF0000"/>
+                <w:sz w:val="16"/>
+                <w:szCs w:val="16"/>
+              </w:rPr>
+              <w:t>KESİNTİ BİLGİLERİ</w:t>
+            </w:r>
+          </w:p>
+        </w:tc>
+      </w:tr>
+      <w:tr>
+        <w:trPr>
+          <w:gridAfter w:val="1"/>
+          <w:wAfter w:w="2389" w:type="dxa"/>
+          <w:trHeight w:val="55"/>
+        </w:trPr>
+        <w:tc>
+          <w:tcPr>
+            <w:tcW w:w="2835" w:type="dxa"/>
+            <w:tcBorders>
+              <w:top w:val="none" w:sz="0" w:space="0" w:color="FFFFFF"/>
+              <w:left w:val="none" w:sz="0" w:space="0" w:color="FFFFFF"/>
+              <w:bottom w:val="none" w:sz="0" w:space="0" w:color="FFFFFF"/>
+              <w:right w:val="none" w:sz="0" w:space="0" w:color="FFFFFF"/>
+            </w:tcBorders>
+            <w:tcMar>
+              <w:top w:w="80" w:type="dxa"/>
+              <w:left w:w="120" w:type="dxa"/>
+              <w:bottom w:w="80" w:type="dxa"/>
+              <w:right w:w="120" w:type="dxa"/>
+            </w:tcMar>
+            <w:vAlign w:val="center"/>
+          </w:tcPr>
+          <w:p>
+            <w:pPr>
+              <w:rPr>
+                <w:sz w:val="12"/>
+                <w:szCs w:val="12"/>
+              </w:rPr>
+            </w:pPr>
+          </w:p>
+        </w:tc>
+        <w:tc>
+          <w:tcPr>
+            <w:tcW w:w="2127" w:type="dxa"/>
+            <w:tcBorders>
+              <w:top w:val="single" w:sz="4" w:space="0" w:color="000000"/>
+              <w:left w:val="single" w:sz="4" w:space="0" w:color="000000"/>
+              <w:bottom w:val="single" w:sz="4" w:space="0" w:color="000000"/>
+              <w:right w:val="single" w:sz="4" w:space="0" w:color="000000"/>
+            </w:tcBorders>
+            <w:tcMar>
+              <w:top w:w="80" w:type="dxa"/>
+              <w:left w:w="120" w:type="dxa"/>
+              <w:bottom w:w="80" w:type="dxa"/>
+              <w:right w:w="120" w:type="dxa"/>
+            </w:tcMar>
+            <w:vAlign w:val="center"/>
+          </w:tcPr>
+          <w:p>
+            <w:pPr>
+              <w:jc w:val="center"/>
+              <w:rPr>
+                <w:sz w:val="12"/>
+                <w:szCs w:val="12"/>
+              </w:rPr>
+            </w:pPr>
+            <w:r>
+              <w:rPr>
+                <w:b/>
+                <w:bCs/>
+                <w:color w:val="000000"/>
+                <w:sz w:val="12"/>
+                <w:szCs w:val="12"/>
+              </w:rPr>
+              <w:t>Kesinti tablosu</w:t>
+            </w:r>
+          </w:p>
+        </w:tc>
+        <w:tc>
+          <w:tcPr>
+            <w:tcW w:w="2551" w:type="dxa"/>
+            <w:gridSpan w:val="2"/>
+            <w:tcBorders>
+              <w:top w:val="none" w:sz="0" w:space="0" w:color="FFFFFF"/>
+              <w:left w:val="none" w:sz="0" w:space="0" w:color="FFFFFF"/>
+              <w:bottom w:val="none" w:sz="0" w:space="0" w:color="FFFFFF"/>
+              <w:right w:val="none" w:sz="0" w:space="0" w:color="FFFFFF"/>
+            </w:tcBorders>
+            <w:tcMar>
+              <w:top w:w="80" w:type="dxa"/>
+              <w:left w:w="120" w:type="dxa"/>
+              <w:bottom w:w="80" w:type="dxa"/>
+              <w:right w:w="120" w:type="dxa"/>
+            </w:tcMar>
+            <w:vAlign w:val="center"/>
+          </w:tcPr>
+          <w:p>
+            <w:pPr>
+              <w:rPr>
+                <w:sz w:val="12"/>
+                <w:szCs w:val="12"/>
+              </w:rPr>
+            </w:pPr>
+          </w:p>
+        </w:tc>
+      </w:tr>
+      <w:tr>
+        <w:trPr>
+          <w:gridAfter w:val="1"/>
+          <w:wAfter w:w="2389" w:type="dxa"/>
+          <w:trHeight w:val="55"/>
+        </w:trPr>
+        <w:tc>
+          <w:tcPr>
+            <w:tcW w:w="2835" w:type="dxa"/>
+            <w:tcBorders>
+              <w:top w:val="single" w:sz="4" w:space="0" w:color="000000"/>
+              <w:left w:val="single" w:sz="4" w:space="0" w:color="000000"/>
+              <w:bottom w:val="single" w:sz="4" w:space="0" w:color="000000"/>
+              <w:right w:val="single" w:sz="4" w:space="0" w:color="000000"/>
+            </w:tcBorders>
+            <w:tcMar>
+              <w:top w:w="80" w:type="dxa"/>
+              <w:left w:w="120" w:type="dxa"/>
+              <w:bottom w:w="80" w:type="dxa"/>
+              <w:right w:w="120" w:type="dxa"/>
+            </w:tcMar>
+            <w:vAlign w:val="center"/>
+          </w:tcPr>
+          <w:p>
+            <w:pPr>
+              <w:rPr>
+                <w:sz w:val="12"/>
+                <w:szCs w:val="12"/>
+              </w:rPr>
+            </w:pPr>
+            <w:r>
+              <w:rPr>
+                <w:b/>
+                <w:bCs/>
+                <w:color w:val="000000"/>
+                <w:sz w:val="12"/>
+                <w:szCs w:val="12"/>
+              </w:rPr>
+              <w:t>Sözleşme Tutarı</w:t>
+            </w:r>
+          </w:p>
+        </w:tc>
+        <w:tc>
+          <w:tcPr>
+            <w:tcW w:w="2127" w:type="dxa"/>
+            <w:tcBorders>
+              <w:top w:val="single" w:sz="4" w:space="0" w:color="000000"/>
+              <w:left w:val="single" w:sz="4" w:space="0" w:color="000000"/>
+              <w:bottom w:val="single" w:sz="4" w:space="0" w:color="000000"/>
+              <w:right w:val="single" w:sz="4" w:space="0" w:color="000000"/>
+            </w:tcBorders>
+            <w:tcMar>
+              <w:top w:w="80" w:type="dxa"/>
+              <w:left w:w="120" w:type="dxa"/>
+              <w:bottom w:w="80" w:type="dxa"/>
+              <w:right w:w="120" w:type="dxa"/>
+            </w:tcMar>
+            <w:vAlign w:val="center"/>
+          </w:tcPr>
+          <w:p>
+            <w:pPr>
+              <w:jc w:val="right"/>
+              <w:rPr>
+                <w:sz w:val="12"/>
+                <w:szCs w:val="12"/>
+              </w:rPr>
+            </w:pPr>
+            <w:r>
+              <w:rPr>
+                <w:color w:val="000000"/>
+                <w:sz w:val="12"/>
+                <w:szCs w:val="12"/>
+              </w:rPr>
+              <w:t>617.526,00</w:t>
+            </w:r>
+          </w:p>
+        </w:tc>
+        <w:tc>
+          <w:tcPr>
+            <w:tcW w:w="2551" w:type="dxa"/>
+            <w:gridSpan w:val="2"/>
+            <w:tcBorders>
+              <w:top w:val="none" w:sz="0" w:space="0" w:color="FFFFFF"/>
+              <w:left w:val="none" w:sz="0" w:space="0" w:color="FFFFFF"/>
+              <w:bottom w:val="none" w:sz="0" w:space="0" w:color="FFFFFF"/>
+              <w:right w:val="none" w:sz="0" w:space="0" w:color="FFFFFF"/>
+            </w:tcBorders>
+            <w:tcMar>
+              <w:top w:w="80" w:type="dxa"/>
+              <w:left w:w="120" w:type="dxa"/>
+              <w:bottom w:w="80" w:type="dxa"/>
+              <w:right w:w="120" w:type="dxa"/>
+            </w:tcMar>
+            <w:vAlign w:val="center"/>
+          </w:tcPr>
+          <w:p>
+            <w:pPr>
+              <w:rPr>
+                <w:sz w:val="12"/>
+                <w:szCs w:val="12"/>
+              </w:rPr>
+            </w:pPr>
+          </w:p>
+        </w:tc>
+      </w:tr>
+      <w:tr>
+        <w:trPr>
+          <w:gridAfter w:val="1"/>
+          <w:wAfter w:w="2389" w:type="dxa"/>
+          <w:trHeight w:val="55"/>
+        </w:trPr>
+        <w:tc>
+          <w:tcPr>
+            <w:tcW w:w="2835" w:type="dxa"/>
+            <w:tcBorders>
+              <w:top w:val="single" w:sz="4" w:space="0" w:color="000000"/>
+              <w:left w:val="single" w:sz="4" w:space="0" w:color="000000"/>
+              <w:bottom w:val="single" w:sz="4" w:space="0" w:color="000000"/>
+              <w:right w:val="single" w:sz="4" w:space="0" w:color="000000"/>
+            </w:tcBorders>
+            <w:tcMar>
+              <w:top w:w="80" w:type="dxa"/>
+              <w:left w:w="120" w:type="dxa"/>
+              <w:bottom w:w="80" w:type="dxa"/>
+              <w:right w:w="120" w:type="dxa"/>
+            </w:tcMar>
+            <w:vAlign w:val="center"/>
+          </w:tcPr>
+          <w:p>
+            <w:pPr>
+              <w:rPr>
+                <w:sz w:val="12"/>
+                <w:szCs w:val="12"/>
+              </w:rPr>
+            </w:pPr>
+            <w:r>
+              <w:rPr>
+                <w:b/>
+                <w:bCs/>
+                <w:color w:val="000000"/>
+                <w:sz w:val="12"/>
+                <w:szCs w:val="12"/>
+              </w:rPr>
+              <w:t>Tahsil edilen toplam tutar</w:t>
+            </w:r>
+          </w:p>
+        </w:tc>
+        <w:tc>
+          <w:tcPr>
+            <w:tcW w:w="2127" w:type="dxa"/>
+            <w:tcBorders>
+              <w:top w:val="single" w:sz="4" w:space="0" w:color="000000"/>
+              <w:left w:val="single" w:sz="4" w:space="0" w:color="000000"/>
+              <w:bottom w:val="single" w:sz="4" w:space="0" w:color="000000"/>
+              <w:right w:val="single" w:sz="4" w:space="0" w:color="000000"/>
+            </w:tcBorders>
+            <w:tcMar>
+              <w:top w:w="80" w:type="dxa"/>
+              <w:left w:w="120" w:type="dxa"/>
+              <w:bottom w:w="80" w:type="dxa"/>
+              <w:right w:w="120" w:type="dxa"/>
+            </w:tcMar>
+            <w:vAlign w:val="center"/>
+          </w:tcPr>
+          <w:p>
+            <w:pPr>
+              <w:jc w:val="right"/>
+              <w:rPr>
+                <w:sz w:val="12"/>
+                <w:szCs w:val="12"/>
+              </w:rPr>
+            </w:pPr>
+            <w:r>
+              <w:rPr>
+                <w:color w:val="000000"/>
+                <w:sz w:val="12"/>
+                <w:szCs w:val="12"/>
+              </w:rPr>
+              <w:t>123.505,20</w:t>
+            </w:r>
+          </w:p>
+        </w:tc>
+        <w:tc>
+          <w:tcPr>
+            <w:tcW w:w="2551" w:type="dxa"/>
+            <w:gridSpan w:val="2"/>
+            <w:tcBorders>
+              <w:top w:val="none" w:sz="0" w:space="0" w:color="FFFFFF"/>
+              <w:left w:val="none" w:sz="0" w:space="0" w:color="FFFFFF"/>
+              <w:bottom w:val="none" w:sz="0" w:space="0" w:color="FFFFFF"/>
+              <w:right w:val="none" w:sz="0" w:space="0" w:color="FFFFFF"/>
+            </w:tcBorders>
+            <w:tcMar>
+              <w:top w:w="80" w:type="dxa"/>
+              <w:left w:w="120" w:type="dxa"/>
+              <w:bottom w:w="80" w:type="dxa"/>
+              <w:right w:w="120" w:type="dxa"/>
+            </w:tcMar>
+            <w:vAlign w:val="center"/>
+          </w:tcPr>
+          <w:p>
+            <w:pPr>
+              <w:rPr>
+                <w:sz w:val="12"/>
+                <w:szCs w:val="12"/>
+              </w:rPr>
+            </w:pPr>
+          </w:p>
+        </w:tc>
+      </w:tr>
+      <w:tr>
+        <w:trPr>
+          <w:gridAfter w:val="1"/>
+          <w:wAfter w:w="2389" w:type="dxa"/>
+          <w:trHeight w:val="55"/>
+        </w:trPr>
+        <w:tc>
+          <w:tcPr>
+            <w:tcW w:w="2835" w:type="dxa"/>
+            <w:tcBorders>
+              <w:top w:val="single" w:sz="4" w:space="0" w:color="000000"/>
+              <w:left w:val="single" w:sz="4" w:space="0" w:color="000000"/>
+              <w:bottom w:val="single" w:sz="4" w:space="0" w:color="000000"/>
+              <w:right w:val="single" w:sz="4" w:space="0" w:color="000000"/>
+            </w:tcBorders>
+            <w:tcMar>
+              <w:top w:w="80" w:type="dxa"/>
+              <w:left w:w="120" w:type="dxa"/>
+              <w:bottom w:w="80" w:type="dxa"/>
+              <w:right w:w="120" w:type="dxa"/>
+            </w:tcMar>
+            <w:vAlign w:val="center"/>
+          </w:tcPr>
+          <w:p>
+            <w:pPr>
+              <w:rPr>
+                <w:sz w:val="12"/>
+                <w:szCs w:val="12"/>
+              </w:rPr>
+            </w:pPr>
+            <w:r>
+              <w:rPr>
+                <w:b/>
+                <w:bCs/>
+                <w:color w:val="000000"/>
+                <w:sz w:val="12"/>
+                <w:szCs w:val="12"/>
+              </w:rPr>
+              <w:t>İhtar masrafı (KDV Dahil)</w:t>
+            </w:r>
+          </w:p>
+        </w:tc>
+        <w:tc>
+          <w:tcPr>
+            <w:tcW w:w="2127" w:type="dxa"/>
+            <w:tcBorders>
+              <w:top w:val="single" w:sz="4" w:space="0" w:color="000000"/>
+              <w:left w:val="single" w:sz="4" w:space="0" w:color="000000"/>
+              <w:bottom w:val="single" w:sz="4" w:space="0" w:color="000000"/>
+              <w:right w:val="single" w:sz="4" w:space="0" w:color="000000"/>
+            </w:tcBorders>
+            <w:tcMar>
+              <w:top w:w="80" w:type="dxa"/>
+              <w:left w:w="120" w:type="dxa"/>
+              <w:bottom w:w="80" w:type="dxa"/>
+              <w:right w:w="120" w:type="dxa"/>
+            </w:tcMar>
+            <w:vAlign w:val="center"/>
+          </w:tcPr>
+          <w:p>
+            <w:pPr>
+              <w:jc w:val="right"/>
+              <w:rPr>
+                <w:sz w:val="12"/>
+                <w:szCs w:val="12"/>
+              </w:rPr>
+            </w:pPr>
+            <w:r>
+              <w:rPr>
+                <w:color w:val="000000"/>
+                <w:sz w:val="12"/>
+                <w:szCs w:val="12"/>
+              </w:rPr>
+              <w:t>1.000,00</w:t>
+            </w:r>
+          </w:p>
+        </w:tc>
+        <w:tc>
+          <w:tcPr>
+            <w:tcW w:w="2551" w:type="dxa"/>
+            <w:gridSpan w:val="2"/>
+            <w:tcBorders>
+              <w:top w:val="none" w:sz="0" w:space="0" w:color="FFFFFF"/>
+              <w:left w:val="none" w:sz="0" w:space="0" w:color="FFFFFF"/>
+              <w:bottom w:val="none" w:sz="0" w:space="0" w:color="FFFFFF"/>
+              <w:right w:val="none" w:sz="0" w:space="0" w:color="FFFFFF"/>
+            </w:tcBorders>
+            <w:tcMar>
+              <w:top w:w="80" w:type="dxa"/>
+              <w:left w:w="120" w:type="dxa"/>
+              <w:bottom w:w="80" w:type="dxa"/>
+              <w:right w:w="120" w:type="dxa"/>
+            </w:tcMar>
+            <w:vAlign w:val="center"/>
+          </w:tcPr>
+          <w:p>
+            <w:pPr>
+              <w:rPr>
+                <w:sz w:val="12"/>
+                <w:szCs w:val="12"/>
+              </w:rPr>
+            </w:pPr>
+          </w:p>
+        </w:tc>
+      </w:tr>
+      <w:tr>
+        <w:trPr>
+          <w:gridAfter w:val="1"/>
+          <w:wAfter w:w="2389" w:type="dxa"/>
+          <w:trHeight w:val="55"/>
+        </w:trPr>
+        <w:tc>
+          <w:tcPr>
+            <w:tcW w:w="2835" w:type="dxa"/>
+            <w:tcBorders>
+              <w:top w:val="single" w:sz="4" w:space="0" w:color="000000"/>
+              <w:left w:val="single" w:sz="4" w:space="0" w:color="000000"/>
+              <w:bottom w:val="single" w:sz="4" w:space="0" w:color="000000"/>
+              <w:right w:val="single" w:sz="4" w:space="0" w:color="000000"/>
+            </w:tcBorders>
+            <w:tcMar>
+              <w:top w:w="80" w:type="dxa"/>
+              <w:left w:w="120" w:type="dxa"/>
+              <w:bottom w:w="80" w:type="dxa"/>
+              <w:right w:w="120" w:type="dxa"/>
+            </w:tcMar>
+            <w:vAlign w:val="center"/>
+          </w:tcPr>
+          <w:p>
+            <w:pPr>
+              <w:rPr>
+                <w:sz w:val="12"/>
+                <w:szCs w:val="12"/>
+              </w:rPr>
+            </w:pPr>
+            <w:r>
+              <w:rPr>
+                <w:b/>
+                <w:bCs/>
+                <w:color w:val="000000"/>
+                <w:sz w:val="12"/>
+                <w:szCs w:val="12"/>
+              </w:rPr>
+              <w:t>Takip Tahsil Masrafı (KDV Dahil)</w:t>
+            </w:r>
+          </w:p>
+        </w:tc>
+        <w:tc>
+          <w:tcPr>
+            <w:tcW w:w="2127" w:type="dxa"/>
+            <w:tcBorders>
+              <w:top w:val="single" w:sz="4" w:space="0" w:color="000000"/>
+              <w:left w:val="single" w:sz="4" w:space="0" w:color="000000"/>
+              <w:bottom w:val="single" w:sz="4" w:space="0" w:color="000000"/>
+              <w:right w:val="single" w:sz="4" w:space="0" w:color="000000"/>
+            </w:tcBorders>
+            <w:tcMar>
+              <w:top w:w="80" w:type="dxa"/>
+              <w:left w:w="120" w:type="dxa"/>
+              <w:bottom w:w="80" w:type="dxa"/>
+              <w:right w:w="120" w:type="dxa"/>
+            </w:tcMar>
+            <w:vAlign w:val="center"/>
+          </w:tcPr>
+          <w:p>
+            <w:pPr>
+              <w:jc w:val="right"/>
+              <w:rPr>
+                <w:sz w:val="12"/>
+                <w:szCs w:val="12"/>
+              </w:rPr>
+            </w:pPr>
+            <w:r>
+              <w:rPr>
+                <w:color w:val="000000"/>
+                <w:sz w:val="12"/>
+                <w:szCs w:val="12"/>
+              </w:rPr>
+              <w:t>4.940,21</w:t>
+            </w:r>
+          </w:p>
+        </w:tc>
+        <w:tc>
+          <w:tcPr>
+            <w:tcW w:w="2551" w:type="dxa"/>
+            <w:gridSpan w:val="2"/>
+            <w:tcBorders>
+              <w:top w:val="none" w:sz="0" w:space="0" w:color="FFFFFF"/>
+              <w:left w:val="none" w:sz="0" w:space="0" w:color="FFFFFF"/>
+              <w:bottom w:val="none" w:sz="0" w:space="0" w:color="FFFFFF"/>
+              <w:right w:val="none" w:sz="0" w:space="0" w:color="FFFFFF"/>
+            </w:tcBorders>
+            <w:tcMar>
+              <w:top w:w="80" w:type="dxa"/>
+              <w:left w:w="120" w:type="dxa"/>
+              <w:bottom w:w="80" w:type="dxa"/>
+              <w:right w:w="120" w:type="dxa"/>
+            </w:tcMar>
+            <w:vAlign w:val="center"/>
+          </w:tcPr>
+          <w:p>
+            <w:pPr>
+              <w:rPr>
+                <w:sz w:val="12"/>
+                <w:szCs w:val="12"/>
+              </w:rPr>
+            </w:pPr>
+          </w:p>
+        </w:tc>
+      </w:tr>
       <w:tr>
         <w:trPr>
           <w:trHeight w:val="55"/>
         </w:trPr>
         <w:tc>
           <w:tcPr>
-            <w:tcW w:w="6651" w:type="dxa"/>
-            <w:gridSpan w:val="4"/>
+            <w:tcW w:w="2835" w:type="dxa"/>
+            <w:tcBorders>
+              <w:top w:val="single" w:sz="4" w:space="0" w:color="000000"/>
+              <w:left w:val="single" w:sz="4" w:space="0" w:color="000000"/>
+              <w:bottom w:val="single" w:sz="4" w:space="0" w:color="000000"/>
+              <w:right w:val="single" w:sz="4" w:space="0" w:color="000000"/>
+            </w:tcBorders>
+            <w:tcMar>
+              <w:top w:w="80" w:type="dxa"/>
+              <w:left w:w="120" w:type="dxa"/>
+              <w:bottom w:w="80" w:type="dxa"/>
+              <w:right w:w="120" w:type="dxa"/>
+            </w:tcMar>
+            <w:vAlign w:val="center"/>
+          </w:tcPr>
+          <w:p>
+            <w:pPr>
+              <w:rPr>
+                <w:sz w:val="12"/>
+                <w:szCs w:val="12"/>
+              </w:rPr>
+            </w:pPr>
+            <w:r>
+              <w:rPr>
+                <w:b/>
+                <w:bCs/>
+                <w:color w:val="000000"/>
+                <w:sz w:val="12"/>
+                <w:szCs w:val="12"/>
+              </w:rPr>
+              <w:t>Vazgeçme Akçesi</w:t>
+            </w:r>
+          </w:p>
+        </w:tc>
+        <w:tc>
+          <w:tcPr>
+            <w:tcW w:w="2127" w:type="dxa"/>
+            <w:tcBorders>
+              <w:top w:val="single" w:sz="4" w:space="0" w:color="000000"/>
+              <w:left w:val="single" w:sz="4" w:space="0" w:color="000000"/>
+              <w:bottom w:val="single" w:sz="4" w:space="0" w:color="000000"/>
+              <w:right w:val="single" w:sz="4" w:space="0" w:color="000000"/>
+            </w:tcBorders>
+            <w:tcMar>
+              <w:top w:w="80" w:type="dxa"/>
+              <w:left w:w="120" w:type="dxa"/>
+              <w:bottom w:w="80" w:type="dxa"/>
+              <w:right w:w="120" w:type="dxa"/>
+            </w:tcMar>
+            <w:vAlign w:val="center"/>
+          </w:tcPr>
+          <w:p>
+            <w:pPr>
+              <w:jc w:val="right"/>
+              <w:rPr>
+                <w:sz w:val="12"/>
+                <w:szCs w:val="12"/>
+              </w:rPr>
+            </w:pPr>
+            <w:r>
+              <w:rPr>
+                <w:color w:val="000000"/>
+                <w:sz w:val="12"/>
+                <w:szCs w:val="12"/>
+              </w:rPr>
+              <w:t>61.752,60</w:t>
+            </w:r>
+          </w:p>
+        </w:tc>
+        <w:tc>
+          <w:tcPr>
+            <w:tcW w:w="2551" w:type="dxa"/>
+            <w:gridSpan w:val="2"/>
             <w:tcBorders>
               <w:top w:val="none" w:sz="0" w:space="0" w:color="FFFFFF"/>
               <w:left w:val="none" w:sz="0" w:space="0" w:color="FFFFFF"/>
               <w:bottom w:val="none" w:sz="0" w:space="0" w:color="FFFFFF"/>
-              <w:right w:val="none" w:sz="0" w:space="0" w:color="FFFFFF"/>
-            </w:tcBorders>
-            <w:tcMar>
-              <w:top w:w="80" w:type="dxa"/>
-              <w:left w:w="120" w:type="dxa"/>
-              <w:bottom w:w="80" w:type="dxa"/>
-              <w:right w:w="120" w:type="dxa"/>
-            </w:tcMar>
-            <w:vAlign w:val="center"/>
-          </w:tcPr>
-          <w:p>
-            <w:pPr>
-              <w:rPr>
-                <w:sz w:val="16"/>
-                <w:szCs w:val="16"/>
-              </w:rPr>
-            </w:pPr>
-            <w:r>
-              <w:rPr>
-                <w:b/>
-                <w:bCs/>
-                <w:color w:val="FF0000"/>
-                <w:sz w:val="16"/>
-                <w:szCs w:val="16"/>
-              </w:rPr>
-              <w:t>KESİNTİ BİLGİLERİ</w:t>
-            </w:r>
+              <w:right w:val="nil"/>
+            </w:tcBorders>
+            <w:tcMar>
+              <w:top w:w="80" w:type="dxa"/>
+              <w:left w:w="120" w:type="dxa"/>
+              <w:bottom w:w="80" w:type="dxa"/>
+              <w:right w:w="120" w:type="dxa"/>
+            </w:tcMar>
+            <w:vAlign w:val="center"/>
+          </w:tcPr>
+          <w:p>
+            <w:pPr>
+              <w:rPr>
+                <w:sz w:val="12"/>
+                <w:szCs w:val="12"/>
+              </w:rPr>
+            </w:pPr>
+          </w:p>
+        </w:tc>
+        <w:tc>
+          <w:tcPr>
+            <w:tcW w:w="2389" w:type="dxa"/>
+            <w:tcBorders>
+              <w:top w:val="nil"/>
+              <w:left w:val="nil"/>
+              <w:bottom w:val="nil"/>
+              <w:right w:val="nil"/>
+            </w:tcBorders>
+            <w:vAlign w:val="center"/>
+          </w:tcPr>
+          <w:p>
+            <w:r>
+              <w:rPr>
+                <w:b/>
+                <w:bCs/>
+                <w:color w:val="000000"/>
+                <w:sz w:val="14"/>
+                <w:szCs w:val="14"/>
+              </w:rPr>
+              <w:t xml:space="preserve">Selda </w:t>
+            </w:r>
+            <w:proofErr w:type="spellStart"/>
+            <w:r>
+              <w:rPr>
+                <w:b/>
+                <w:bCs/>
+                <w:color w:val="000000"/>
+                <w:sz w:val="14"/>
+                <w:szCs w:val="14"/>
+              </w:rPr>
+              <w:t>Ergön</w:t>
+            </w:r>
+            <w:proofErr w:type="spellEnd"/>
           </w:p>
         </w:tc>
       </w:tr>
       <w:tr>
         <w:trPr>
-          <w:gridAfter w:val="1"/>
-          <w:wAfter w:w="1429" w:type="dxa"/>
           <w:trHeight w:val="55"/>
         </w:trPr>
         <w:tc>
           <w:tcPr>
             <w:tcW w:w="2835" w:type="dxa"/>
+            <w:tcBorders>
+              <w:top w:val="single" w:sz="4" w:space="0" w:color="000000"/>
+              <w:left w:val="single" w:sz="4" w:space="0" w:color="000000"/>
+              <w:bottom w:val="single" w:sz="4" w:space="0" w:color="000000"/>
+              <w:right w:val="single" w:sz="4" w:space="0" w:color="000000"/>
+            </w:tcBorders>
+            <w:tcMar>
+              <w:top w:w="80" w:type="dxa"/>
+              <w:left w:w="120" w:type="dxa"/>
+              <w:bottom w:w="80" w:type="dxa"/>
+              <w:right w:w="120" w:type="dxa"/>
+            </w:tcMar>
+            <w:vAlign w:val="center"/>
+          </w:tcPr>
+          <w:p>
+            <w:pPr>
+              <w:rPr>
+                <w:sz w:val="12"/>
+                <w:szCs w:val="12"/>
+              </w:rPr>
+            </w:pPr>
+            <w:r>
+              <w:rPr>
+                <w:b/>
+                <w:bCs/>
+                <w:color w:val="FF0000"/>
+                <w:sz w:val="12"/>
+                <w:szCs w:val="12"/>
+              </w:rPr>
+              <w:t>Kalan Tutar</w:t>
+            </w:r>
+          </w:p>
+        </w:tc>
+        <w:tc>
+          <w:tcPr>
+            <w:tcW w:w="2127" w:type="dxa"/>
+            <w:tcBorders>
+              <w:top w:val="single" w:sz="4" w:space="0" w:color="000000"/>
+              <w:left w:val="single" w:sz="4" w:space="0" w:color="000000"/>
+              <w:bottom w:val="single" w:sz="4" w:space="0" w:color="000000"/>
+              <w:right w:val="single" w:sz="4" w:space="0" w:color="000000"/>
+            </w:tcBorders>
+            <w:tcMar>
+              <w:top w:w="80" w:type="dxa"/>
+              <w:left w:w="120" w:type="dxa"/>
+              <w:bottom w:w="80" w:type="dxa"/>
+              <w:right w:w="120" w:type="dxa"/>
+            </w:tcMar>
+            <w:vAlign w:val="center"/>
+          </w:tcPr>
+          <w:p>
+            <w:pPr>
+              <w:jc w:val="right"/>
+              <w:rPr>
+                <w:sz w:val="12"/>
+                <w:szCs w:val="12"/>
+              </w:rPr>
+            </w:pPr>
+            <w:r>
+              <w:rPr>
+                <w:b/>
+                <w:bCs/>
+                <w:color w:val="FF0000"/>
+                <w:sz w:val="12"/>
+                <w:szCs w:val="12"/>
+              </w:rPr>
+              <w:t>55.812,39</w:t>
+            </w:r>
+          </w:p>
+        </w:tc>
+        <w:tc>
+          <w:tcPr>
+            <w:tcW w:w="2551" w:type="dxa"/>
+            <w:gridSpan w:val="2"/>
             <w:tcBorders>
               <w:top w:val="none" w:sz="0" w:space="0" w:color="FFFFFF"/>
               <w:left w:val="none" w:sz="0" w:space="0" w:color="FFFFFF"/>
               <w:bottom w:val="none" w:sz="0" w:space="0" w:color="FFFFFF"/>
-              <w:right w:val="none" w:sz="0" w:space="0" w:color="FFFFFF"/>
-            </w:tcBorders>
-            <w:tcMar>
-              <w:top w:w="80" w:type="dxa"/>
-              <w:left w:w="120" w:type="dxa"/>
-              <w:bottom w:w="80" w:type="dxa"/>
-              <w:right w:w="120" w:type="dxa"/>
-            </w:tcMar>
-            <w:vAlign w:val="center"/>
-          </w:tcPr>
-          <w:p>
-            <w:pPr>
-              <w:rPr>
-                <w:sz w:val="12"/>
-                <w:szCs w:val="12"/>
-              </w:rPr>
-            </w:pPr>
-          </w:p>
-        </w:tc>
-        <w:tc>
-          <w:tcPr>
-            <w:tcW w:w="2127" w:type="dxa"/>
-            <w:tcBorders>
-              <w:top w:val="single" w:sz="4" w:space="0" w:color="000000"/>
-              <w:left w:val="single" w:sz="4" w:space="0" w:color="000000"/>
-              <w:bottom w:val="single" w:sz="4" w:space="0" w:color="000000"/>
-              <w:right w:val="single" w:sz="4" w:space="0" w:color="000000"/>
-            </w:tcBorders>
-            <w:tcMar>
-              <w:top w:w="80" w:type="dxa"/>
-              <w:left w:w="120" w:type="dxa"/>
-              <w:bottom w:w="80" w:type="dxa"/>
-              <w:right w:w="120" w:type="dxa"/>
-            </w:tcMar>
-            <w:vAlign w:val="center"/>
-          </w:tcPr>
-          <w:p>
-            <w:pPr>
-              <w:jc w:val="center"/>
-              <w:rPr>
-                <w:sz w:val="12"/>
-                <w:szCs w:val="12"/>
-              </w:rPr>
-            </w:pPr>
-            <w:r>
-              <w:rPr>
-                <w:b/>
-                <w:bCs/>
-                <w:color w:val="000000"/>
-                <w:sz w:val="12"/>
-                <w:szCs w:val="12"/>
-              </w:rPr>
-              <w:t>Kesinti tablosu</w:t>
-            </w:r>
-          </w:p>
-        </w:tc>
-        <w:tc>
-          <w:tcPr>
-            <w:tcW w:w="260" w:type="dxa"/>
-            <w:tcBorders>
-              <w:top w:val="none" w:sz="0" w:space="0" w:color="FFFFFF"/>
-              <w:left w:val="none" w:sz="0" w:space="0" w:color="FFFFFF"/>
-              <w:bottom w:val="none" w:sz="0" w:space="0" w:color="FFFFFF"/>
-              <w:right w:val="none" w:sz="0" w:space="0" w:color="FFFFFF"/>
-            </w:tcBorders>
-            <w:tcMar>
-              <w:top w:w="80" w:type="dxa"/>
-              <w:left w:w="120" w:type="dxa"/>
-              <w:bottom w:w="80" w:type="dxa"/>
-              <w:right w:w="120" w:type="dxa"/>
-            </w:tcMar>
-            <w:vAlign w:val="center"/>
-          </w:tcPr>
-          <w:p>
-            <w:pPr>
-              <w:rPr>
-                <w:sz w:val="12"/>
-                <w:szCs w:val="12"/>
-              </w:rPr>
-            </w:pPr>
-          </w:p>
-        </w:tc>
-      </w:tr>
-      <w:tr>
-        <w:trPr>
-          <w:gridAfter w:val="1"/>
-          <w:wAfter w:w="1429" w:type="dxa"/>
-          <w:trHeight w:val="55"/>
-        </w:trPr>
-        <w:tc>
-          <w:tcPr>
-            <w:tcW w:w="2835" w:type="dxa"/>
-            <w:tcBorders>
-              <w:top w:val="single" w:sz="4" w:space="0" w:color="000000"/>
-              <w:left w:val="single" w:sz="4" w:space="0" w:color="000000"/>
-              <w:bottom w:val="single" w:sz="4" w:space="0" w:color="000000"/>
-              <w:right w:val="single" w:sz="4" w:space="0" w:color="000000"/>
-            </w:tcBorders>
-            <w:tcMar>
-              <w:top w:w="80" w:type="dxa"/>
-              <w:left w:w="120" w:type="dxa"/>
-              <w:bottom w:w="80" w:type="dxa"/>
-              <w:right w:w="120" w:type="dxa"/>
-            </w:tcMar>
-            <w:vAlign w:val="center"/>
-          </w:tcPr>
-          <w:p>
-            <w:pPr>
-              <w:rPr>
-                <w:sz w:val="12"/>
-                <w:szCs w:val="12"/>
-              </w:rPr>
-            </w:pPr>
-            <w:r>
-              <w:rPr>
-                <w:b/>
-                <w:bCs/>
-                <w:color w:val="000000"/>
-                <w:sz w:val="12"/>
-                <w:szCs w:val="12"/>
-              </w:rPr>
-              <w:t>Sözleşme Tutarı</w:t>
-            </w:r>
-          </w:p>
-        </w:tc>
-        <w:tc>
-          <w:tcPr>
-            <w:tcW w:w="2127" w:type="dxa"/>
-            <w:tcBorders>
-              <w:top w:val="single" w:sz="4" w:space="0" w:color="000000"/>
-              <w:left w:val="single" w:sz="4" w:space="0" w:color="000000"/>
-              <w:bottom w:val="single" w:sz="4" w:space="0" w:color="000000"/>
-              <w:right w:val="single" w:sz="4" w:space="0" w:color="000000"/>
-            </w:tcBorders>
-            <w:tcMar>
-              <w:top w:w="80" w:type="dxa"/>
-              <w:left w:w="120" w:type="dxa"/>
-              <w:bottom w:w="80" w:type="dxa"/>
-              <w:right w:w="120" w:type="dxa"/>
-            </w:tcMar>
-            <w:vAlign w:val="center"/>
-          </w:tcPr>
-          <w:p>
-            <w:pPr>
-              <w:jc w:val="right"/>
-              <w:rPr>
-                <w:sz w:val="12"/>
-                <w:szCs w:val="12"/>
-              </w:rPr>
-            </w:pPr>
-            <w:r>
-              <w:rPr>
-                <w:color w:val="000000"/>
-                <w:sz w:val="12"/>
-                <w:szCs w:val="12"/>
-              </w:rPr>
-              <w:t>617.526,00</w:t>
-            </w:r>
-          </w:p>
-        </w:tc>
-        <w:tc>
-          <w:tcPr>
-            <w:tcW w:w="260" w:type="dxa"/>
-            <w:tcBorders>
-              <w:top w:val="none" w:sz="0" w:space="0" w:color="FFFFFF"/>
-              <w:left w:val="none" w:sz="0" w:space="0" w:color="FFFFFF"/>
-              <w:bottom w:val="none" w:sz="0" w:space="0" w:color="FFFFFF"/>
-              <w:right w:val="none" w:sz="0" w:space="0" w:color="FFFFFF"/>
-            </w:tcBorders>
-            <w:tcMar>
-              <w:top w:w="80" w:type="dxa"/>
-              <w:left w:w="120" w:type="dxa"/>
-              <w:bottom w:w="80" w:type="dxa"/>
-              <w:right w:w="120" w:type="dxa"/>
-            </w:tcMar>
-            <w:vAlign w:val="center"/>
-          </w:tcPr>
-          <w:p>
-            <w:pPr>
-              <w:rPr>
-                <w:sz w:val="12"/>
-                <w:szCs w:val="12"/>
-              </w:rPr>
-            </w:pPr>
-          </w:p>
-        </w:tc>
-      </w:tr>
-      <w:tr>
-        <w:trPr>
-          <w:gridAfter w:val="1"/>
-          <w:wAfter w:w="1429" w:type="dxa"/>
-          <w:trHeight w:val="55"/>
-        </w:trPr>
-        <w:tc>
-          <w:tcPr>
-            <w:tcW w:w="2835" w:type="dxa"/>
-            <w:tcBorders>
-              <w:top w:val="single" w:sz="4" w:space="0" w:color="000000"/>
-              <w:left w:val="single" w:sz="4" w:space="0" w:color="000000"/>
-              <w:bottom w:val="single" w:sz="4" w:space="0" w:color="000000"/>
-              <w:right w:val="single" w:sz="4" w:space="0" w:color="000000"/>
-            </w:tcBorders>
-            <w:tcMar>
-              <w:top w:w="80" w:type="dxa"/>
-              <w:left w:w="120" w:type="dxa"/>
-              <w:bottom w:w="80" w:type="dxa"/>
-              <w:right w:w="120" w:type="dxa"/>
-            </w:tcMar>
-            <w:vAlign w:val="center"/>
-          </w:tcPr>
-          <w:p>
-            <w:pPr>
-              <w:rPr>
-                <w:sz w:val="12"/>
-                <w:szCs w:val="12"/>
-              </w:rPr>
-            </w:pPr>
-            <w:r>
-              <w:rPr>
-                <w:b/>
-                <w:bCs/>
-                <w:color w:val="000000"/>
-                <w:sz w:val="12"/>
-                <w:szCs w:val="12"/>
-              </w:rPr>
-              <w:t>Tahsil edilen toplam tutar</w:t>
-            </w:r>
-          </w:p>
-        </w:tc>
-        <w:tc>
-          <w:tcPr>
-            <w:tcW w:w="2127" w:type="dxa"/>
-            <w:tcBorders>
-              <w:top w:val="single" w:sz="4" w:space="0" w:color="000000"/>
-              <w:left w:val="single" w:sz="4" w:space="0" w:color="000000"/>
-              <w:bottom w:val="single" w:sz="4" w:space="0" w:color="000000"/>
-              <w:right w:val="single" w:sz="4" w:space="0" w:color="000000"/>
-            </w:tcBorders>
-            <w:tcMar>
-              <w:top w:w="80" w:type="dxa"/>
-              <w:left w:w="120" w:type="dxa"/>
-              <w:bottom w:w="80" w:type="dxa"/>
-              <w:right w:w="120" w:type="dxa"/>
-            </w:tcMar>
-            <w:vAlign w:val="center"/>
-          </w:tcPr>
-          <w:p>
-            <w:pPr>
-              <w:jc w:val="right"/>
-              <w:rPr>
-                <w:sz w:val="12"/>
-                <w:szCs w:val="12"/>
-              </w:rPr>
-            </w:pPr>
-            <w:r>
-              <w:rPr>
-                <w:color w:val="000000"/>
-                <w:sz w:val="12"/>
-                <w:szCs w:val="12"/>
-              </w:rPr>
-              <w:t>123.505,20</w:t>
-            </w:r>
-          </w:p>
-        </w:tc>
-        <w:tc>
-          <w:tcPr>
-            <w:tcW w:w="260" w:type="dxa"/>
-            <w:tcBorders>
-              <w:top w:val="none" w:sz="0" w:space="0" w:color="FFFFFF"/>
-              <w:left w:val="none" w:sz="0" w:space="0" w:color="FFFFFF"/>
-              <w:bottom w:val="none" w:sz="0" w:space="0" w:color="FFFFFF"/>
-              <w:right w:val="none" w:sz="0" w:space="0" w:color="FFFFFF"/>
-            </w:tcBorders>
-            <w:tcMar>
-              <w:top w:w="80" w:type="dxa"/>
-              <w:left w:w="120" w:type="dxa"/>
-              <w:bottom w:w="80" w:type="dxa"/>
-              <w:right w:w="120" w:type="dxa"/>
-            </w:tcMar>
-            <w:vAlign w:val="center"/>
-          </w:tcPr>
-          <w:p>
-            <w:pPr>
-              <w:rPr>
-                <w:sz w:val="12"/>
-                <w:szCs w:val="12"/>
-              </w:rPr>
-            </w:pPr>
-          </w:p>
-        </w:tc>
-      </w:tr>
-      <w:tr>
-        <w:trPr>
-          <w:gridAfter w:val="1"/>
-          <w:wAfter w:w="1429" w:type="dxa"/>
-          <w:trHeight w:val="55"/>
-        </w:trPr>
-        <w:tc>
-          <w:tcPr>
-            <w:tcW w:w="2835" w:type="dxa"/>
-            <w:tcBorders>
-              <w:top w:val="single" w:sz="4" w:space="0" w:color="000000"/>
-              <w:left w:val="single" w:sz="4" w:space="0" w:color="000000"/>
-              <w:bottom w:val="single" w:sz="4" w:space="0" w:color="000000"/>
-              <w:right w:val="single" w:sz="4" w:space="0" w:color="000000"/>
-            </w:tcBorders>
-            <w:tcMar>
-              <w:top w:w="80" w:type="dxa"/>
-              <w:left w:w="120" w:type="dxa"/>
-              <w:bottom w:w="80" w:type="dxa"/>
-              <w:right w:w="120" w:type="dxa"/>
-            </w:tcMar>
-            <w:vAlign w:val="center"/>
-          </w:tcPr>
-          <w:p>
-            <w:pPr>
-              <w:rPr>
-                <w:sz w:val="12"/>
-                <w:szCs w:val="12"/>
-              </w:rPr>
-            </w:pPr>
-            <w:r>
-              <w:rPr>
-                <w:b/>
-                <w:bCs/>
-                <w:color w:val="000000"/>
-                <w:sz w:val="12"/>
-                <w:szCs w:val="12"/>
-              </w:rPr>
-              <w:t>İhtar masrafı (KDV Dahil)</w:t>
-            </w:r>
-          </w:p>
-        </w:tc>
-        <w:tc>
-          <w:tcPr>
-            <w:tcW w:w="2127" w:type="dxa"/>
-            <w:tcBorders>
-              <w:top w:val="single" w:sz="4" w:space="0" w:color="000000"/>
-              <w:left w:val="single" w:sz="4" w:space="0" w:color="000000"/>
-              <w:bottom w:val="single" w:sz="4" w:space="0" w:color="000000"/>
-              <w:right w:val="single" w:sz="4" w:space="0" w:color="000000"/>
-            </w:tcBorders>
-            <w:tcMar>
-              <w:top w:w="80" w:type="dxa"/>
-              <w:left w:w="120" w:type="dxa"/>
-              <w:bottom w:w="80" w:type="dxa"/>
-              <w:right w:w="120" w:type="dxa"/>
-            </w:tcMar>
-            <w:vAlign w:val="center"/>
-          </w:tcPr>
-          <w:p>
-            <w:pPr>
-              <w:jc w:val="right"/>
-              <w:rPr>
-                <w:sz w:val="12"/>
-                <w:szCs w:val="12"/>
-              </w:rPr>
-            </w:pPr>
-            <w:r>
-              <w:rPr>
-                <w:color w:val="000000"/>
-                <w:sz w:val="12"/>
-                <w:szCs w:val="12"/>
-              </w:rPr>
-              <w:t>1.000,00</w:t>
-            </w:r>
-          </w:p>
-        </w:tc>
-        <w:tc>
-          <w:tcPr>
-            <w:tcW w:w="260" w:type="dxa"/>
-            <w:tcBorders>
-              <w:top w:val="none" w:sz="0" w:space="0" w:color="FFFFFF"/>
-              <w:left w:val="none" w:sz="0" w:space="0" w:color="FFFFFF"/>
-              <w:bottom w:val="none" w:sz="0" w:space="0" w:color="FFFFFF"/>
-              <w:right w:val="none" w:sz="0" w:space="0" w:color="FFFFFF"/>
-            </w:tcBorders>
-            <w:tcMar>
-              <w:top w:w="80" w:type="dxa"/>
-              <w:left w:w="120" w:type="dxa"/>
-              <w:bottom w:w="80" w:type="dxa"/>
-              <w:right w:w="120" w:type="dxa"/>
-            </w:tcMar>
-            <w:vAlign w:val="center"/>
-          </w:tcPr>
-          <w:p>
-            <w:pPr>
-              <w:rPr>
-                <w:sz w:val="12"/>
-                <w:szCs w:val="12"/>
-              </w:rPr>
-            </w:pPr>
-          </w:p>
-        </w:tc>
-      </w:tr>
-      <w:tr>
-        <w:trPr>
-          <w:gridAfter w:val="1"/>
-          <w:wAfter w:w="1429" w:type="dxa"/>
-          <w:trHeight w:val="55"/>
-        </w:trPr>
-        <w:tc>
-          <w:tcPr>
-            <w:tcW w:w="2835" w:type="dxa"/>
-            <w:tcBorders>
-              <w:top w:val="single" w:sz="4" w:space="0" w:color="000000"/>
-              <w:left w:val="single" w:sz="4" w:space="0" w:color="000000"/>
-              <w:bottom w:val="single" w:sz="4" w:space="0" w:color="000000"/>
-              <w:right w:val="single" w:sz="4" w:space="0" w:color="000000"/>
-            </w:tcBorders>
-            <w:tcMar>
-              <w:top w:w="80" w:type="dxa"/>
-              <w:left w:w="120" w:type="dxa"/>
-              <w:bottom w:w="80" w:type="dxa"/>
-              <w:right w:w="120" w:type="dxa"/>
-            </w:tcMar>
-            <w:vAlign w:val="center"/>
-          </w:tcPr>
-          <w:p>
-            <w:pPr>
-              <w:rPr>
-                <w:sz w:val="12"/>
-                <w:szCs w:val="12"/>
-              </w:rPr>
-            </w:pPr>
-            <w:r>
-              <w:rPr>
-                <w:b/>
-                <w:bCs/>
-                <w:color w:val="000000"/>
-                <w:sz w:val="12"/>
-                <w:szCs w:val="12"/>
-              </w:rPr>
-              <w:t>Takip Tahsil Masrafı (KDV Dahil)</w:t>
-            </w:r>
-          </w:p>
-        </w:tc>
-        <w:tc>
-          <w:tcPr>
-            <w:tcW w:w="2127" w:type="dxa"/>
-            <w:tcBorders>
-              <w:top w:val="single" w:sz="4" w:space="0" w:color="000000"/>
-              <w:left w:val="single" w:sz="4" w:space="0" w:color="000000"/>
-              <w:bottom w:val="single" w:sz="4" w:space="0" w:color="000000"/>
-              <w:right w:val="single" w:sz="4" w:space="0" w:color="000000"/>
-            </w:tcBorders>
-            <w:tcMar>
-              <w:top w:w="80" w:type="dxa"/>
-              <w:left w:w="120" w:type="dxa"/>
-              <w:bottom w:w="80" w:type="dxa"/>
-              <w:right w:w="120" w:type="dxa"/>
-            </w:tcMar>
-            <w:vAlign w:val="center"/>
-          </w:tcPr>
-          <w:p>
-            <w:pPr>
-              <w:jc w:val="right"/>
-              <w:rPr>
-                <w:sz w:val="12"/>
-                <w:szCs w:val="12"/>
-              </w:rPr>
-            </w:pPr>
-            <w:r>
-              <w:rPr>
-                <w:color w:val="000000"/>
-                <w:sz w:val="12"/>
-                <w:szCs w:val="12"/>
-              </w:rPr>
-              <w:t>4.940,21</w:t>
-            </w:r>
-          </w:p>
-        </w:tc>
-        <w:tc>
-          <w:tcPr>
-            <w:tcW w:w="260" w:type="dxa"/>
-            <w:tcBorders>
-              <w:top w:val="none" w:sz="0" w:space="0" w:color="FFFFFF"/>
-              <w:left w:val="none" w:sz="0" w:space="0" w:color="FFFFFF"/>
-              <w:bottom w:val="none" w:sz="0" w:space="0" w:color="FFFFFF"/>
-              <w:right w:val="none" w:sz="0" w:space="0" w:color="FFFFFF"/>
-            </w:tcBorders>
-            <w:tcMar>
-              <w:top w:w="80" w:type="dxa"/>
-              <w:left w:w="120" w:type="dxa"/>
-              <w:bottom w:w="80" w:type="dxa"/>
-              <w:right w:w="120" w:type="dxa"/>
-            </w:tcMar>
-            <w:vAlign w:val="center"/>
-          </w:tcPr>
-          <w:p>
-            <w:pPr>
-              <w:rPr>
-                <w:sz w:val="12"/>
-                <w:szCs w:val="12"/>
-              </w:rPr>
-            </w:pPr>
-          </w:p>
-        </w:tc>
-      </w:tr>
-      <w:tr>
-        <w:trPr>
-          <w:gridAfter w:val="1"/>
-          <w:wAfter w:w="1429" w:type="dxa"/>
-          <w:trHeight w:val="55"/>
-        </w:trPr>
-        <w:tc>
-          <w:tcPr>
-            <w:tcW w:w="2835" w:type="dxa"/>
-            <w:tcBorders>
-              <w:top w:val="single" w:sz="4" w:space="0" w:color="000000"/>
-              <w:left w:val="single" w:sz="4" w:space="0" w:color="000000"/>
-              <w:bottom w:val="single" w:sz="4" w:space="0" w:color="000000"/>
-              <w:right w:val="single" w:sz="4" w:space="0" w:color="000000"/>
-            </w:tcBorders>
-            <w:tcMar>
-              <w:top w:w="80" w:type="dxa"/>
-              <w:left w:w="120" w:type="dxa"/>
-              <w:bottom w:w="80" w:type="dxa"/>
-              <w:right w:w="120" w:type="dxa"/>
-            </w:tcMar>
-            <w:vAlign w:val="center"/>
-          </w:tcPr>
-          <w:p>
-            <w:pPr>
-              <w:rPr>
-                <w:sz w:val="12"/>
-                <w:szCs w:val="12"/>
-              </w:rPr>
-            </w:pPr>
-            <w:r>
-              <w:rPr>
-                <w:b/>
-                <w:bCs/>
-                <w:color w:val="000000"/>
-                <w:sz w:val="12"/>
-                <w:szCs w:val="12"/>
-              </w:rPr>
-              <w:t>Vazgeçme Akçesi</w:t>
-            </w:r>
-          </w:p>
-        </w:tc>
-        <w:tc>
-          <w:tcPr>
-            <w:tcW w:w="2127" w:type="dxa"/>
-            <w:tcBorders>
-              <w:top w:val="single" w:sz="4" w:space="0" w:color="000000"/>
-              <w:left w:val="single" w:sz="4" w:space="0" w:color="000000"/>
-              <w:bottom w:val="single" w:sz="4" w:space="0" w:color="000000"/>
-              <w:right w:val="single" w:sz="4" w:space="0" w:color="000000"/>
-            </w:tcBorders>
-            <w:tcMar>
-              <w:top w:w="80" w:type="dxa"/>
-              <w:left w:w="120" w:type="dxa"/>
-              <w:bottom w:w="80" w:type="dxa"/>
-              <w:right w:w="120" w:type="dxa"/>
-            </w:tcMar>
-            <w:vAlign w:val="center"/>
-          </w:tcPr>
-          <w:p>
-            <w:pPr>
-              <w:jc w:val="right"/>
-              <w:rPr>
-                <w:sz w:val="12"/>
-                <w:szCs w:val="12"/>
-              </w:rPr>
-            </w:pPr>
-            <w:r>
-              <w:rPr>
-                <w:color w:val="000000"/>
-                <w:sz w:val="12"/>
-                <w:szCs w:val="12"/>
-              </w:rPr>
-              <w:t>61.752,60</w:t>
-            </w:r>
-          </w:p>
-        </w:tc>
-        <w:tc>
-          <w:tcPr>
-            <w:tcW w:w="260" w:type="dxa"/>
-            <w:tcBorders>
-              <w:top w:val="none" w:sz="0" w:space="0" w:color="FFFFFF"/>
-              <w:left w:val="none" w:sz="0" w:space="0" w:color="FFFFFF"/>
-              <w:bottom w:val="none" w:sz="0" w:space="0" w:color="FFFFFF"/>
-              <w:right w:val="none" w:sz="0" w:space="0" w:color="FFFFFF"/>
-            </w:tcBorders>
-            <w:tcMar>
-              <w:top w:w="80" w:type="dxa"/>
-              <w:left w:w="120" w:type="dxa"/>
-              <w:bottom w:w="80" w:type="dxa"/>
-              <w:right w:w="120" w:type="dxa"/>
-            </w:tcMar>
-            <w:vAlign w:val="center"/>
-          </w:tcPr>
-          <w:p>
-            <w:pPr>
-              <w:rPr>
-                <w:sz w:val="12"/>
-                <w:szCs w:val="12"/>
-              </w:rPr>
-            </w:pPr>
-          </w:p>
-        </w:tc>
-      </w:tr>
-      <w:tr>
-        <w:trPr>
-          <w:gridAfter w:val="1"/>
-          <w:wAfter w:w="1429" w:type="dxa"/>
-          <w:trHeight w:val="55"/>
-        </w:trPr>
-        <w:tc>
-          <w:tcPr>
-            <w:tcW w:w="2835" w:type="dxa"/>
-            <w:tcBorders>
-              <w:top w:val="single" w:sz="4" w:space="0" w:color="000000"/>
-              <w:left w:val="single" w:sz="4" w:space="0" w:color="000000"/>
-              <w:bottom w:val="single" w:sz="4" w:space="0" w:color="000000"/>
-              <w:right w:val="single" w:sz="4" w:space="0" w:color="000000"/>
-            </w:tcBorders>
-            <w:tcMar>
-              <w:top w:w="80" w:type="dxa"/>
-              <w:left w:w="120" w:type="dxa"/>
-              <w:bottom w:w="80" w:type="dxa"/>
-              <w:right w:w="120" w:type="dxa"/>
-            </w:tcMar>
-            <w:vAlign w:val="center"/>
-          </w:tcPr>
-          <w:p>
-            <w:pPr>
-              <w:rPr>
-                <w:sz w:val="12"/>
-                <w:szCs w:val="12"/>
-              </w:rPr>
-            </w:pPr>
-            <w:r>
-              <w:rPr>
-                <w:b/>
-                <w:bCs/>
-                <w:color w:val="FF0000"/>
-                <w:sz w:val="12"/>
-                <w:szCs w:val="12"/>
-              </w:rPr>
-              <w:t>Kalan Tutar</w:t>
-            </w:r>
-          </w:p>
-        </w:tc>
-        <w:tc>
-          <w:tcPr>
-            <w:tcW w:w="2127" w:type="dxa"/>
-            <w:tcBorders>
-              <w:top w:val="single" w:sz="4" w:space="0" w:color="000000"/>
-              <w:left w:val="single" w:sz="4" w:space="0" w:color="000000"/>
-              <w:bottom w:val="single" w:sz="4" w:space="0" w:color="000000"/>
-              <w:right w:val="single" w:sz="4" w:space="0" w:color="000000"/>
-            </w:tcBorders>
-            <w:tcMar>
-              <w:top w:w="80" w:type="dxa"/>
-              <w:left w:w="120" w:type="dxa"/>
-              <w:bottom w:w="80" w:type="dxa"/>
-              <w:right w:w="120" w:type="dxa"/>
-            </w:tcMar>
-            <w:vAlign w:val="center"/>
-          </w:tcPr>
-          <w:p>
-            <w:pPr>
-              <w:jc w:val="right"/>
-              <w:rPr>
-                <w:sz w:val="12"/>
-                <w:szCs w:val="12"/>
-              </w:rPr>
-            </w:pPr>
-            <w:r>
-              <w:rPr>
-                <w:b/>
-                <w:bCs/>
-                <w:color w:val="FF0000"/>
-                <w:sz w:val="12"/>
-                <w:szCs w:val="12"/>
-              </w:rPr>
-              <w:t>55.812,39</w:t>
-            </w:r>
-          </w:p>
-        </w:tc>
-        <w:tc>
-          <w:tcPr>
-            <w:tcW w:w="260" w:type="dxa"/>
-            <w:tcBorders>
-              <w:top w:val="none" w:sz="0" w:space="0" w:color="FFFFFF"/>
-              <w:left w:val="none" w:sz="0" w:space="0" w:color="FFFFFF"/>
-              <w:bottom w:val="none" w:sz="0" w:space="0" w:color="FFFFFF"/>
-              <w:right w:val="none" w:sz="0" w:space="0" w:color="FFFFFF"/>
-            </w:tcBorders>
-            <w:tcMar>
-              <w:top w:w="80" w:type="dxa"/>
-              <w:left w:w="120" w:type="dxa"/>
-              <w:bottom w:w="80" w:type="dxa"/>
-              <w:right w:w="120" w:type="dxa"/>
-            </w:tcMar>
-            <w:vAlign w:val="center"/>
-          </w:tcPr>
-          <w:p>
-            <w:pPr>
-              <w:rPr>
-                <w:sz w:val="12"/>
-                <w:szCs w:val="12"/>
-              </w:rPr>
-            </w:pPr>
+              <w:right w:val="nil"/>
+            </w:tcBorders>
+            <w:tcMar>
+              <w:top w:w="80" w:type="dxa"/>
+              <w:left w:w="120" w:type="dxa"/>
+              <w:bottom w:w="80" w:type="dxa"/>
+              <w:right w:w="120" w:type="dxa"/>
+            </w:tcMar>
+            <w:vAlign w:val="center"/>
+          </w:tcPr>
+          <w:p>
+            <w:pPr>
+              <w:rPr>
+                <w:sz w:val="12"/>
+                <w:szCs w:val="12"/>
+              </w:rPr>
+            </w:pPr>
+          </w:p>
+        </w:tc>
+        <w:tc>
+          <w:tcPr>
+            <w:tcW w:w="2389" w:type="dxa"/>
+            <w:tcBorders>
+              <w:top w:val="nil"/>
+              <w:left w:val="nil"/>
+              <w:bottom w:val="nil"/>
+              <w:right w:val="nil"/>
+            </w:tcBorders>
+            <w:vAlign w:val="center"/>
+          </w:tcPr>
+          <w:p>
+            <w:r>
+              <w:rPr>
+                <w:color w:val="000000"/>
+                <w:sz w:val="14"/>
+                <w:szCs w:val="14"/>
+              </w:rPr>
+              <w:t xml:space="preserve">Kredi Takip ve Risk İzleme </w:t>
+            </w:r>
+            <w:proofErr w:type="spellStart"/>
+            <w:r>
+              <w:rPr>
+                <w:color w:val="000000"/>
+                <w:sz w:val="14"/>
+                <w:szCs w:val="14"/>
+              </w:rPr>
+              <w:t>Mdr.Yrd</w:t>
+            </w:r>
+            <w:proofErr w:type="spellEnd"/>
+            <w:r>
+              <w:rPr>
+                <w:color w:val="000000"/>
+                <w:sz w:val="14"/>
+                <w:szCs w:val="14"/>
+              </w:rPr>
+              <w:t>.</w:t>
+            </w:r>
           </w:p>
         </w:tc>
       </w:tr>
@@ -3052,14 +3134,46 @@
           <w:sz w:val="16"/>
           <w:szCs w:val="16"/>
         </w:rPr>
-        <w:t xml:space="preserve">{{ihtar_kelimesi}} </w:t>
+        <w:t>{{</w:t>
+      </w:r>
+      <w:proofErr w:type="spellStart"/>
+      <w:r>
+        <w:rPr>
+          <w:sz w:val="16"/>
+          <w:szCs w:val="16"/>
+        </w:rPr>
+        <w:t>ihtar_kelimesi</w:t>
+      </w:r>
+      <w:proofErr w:type="spellEnd"/>
+      <w:r>
+        <w:rPr>
+          <w:sz w:val="16"/>
+          <w:szCs w:val="16"/>
+        </w:rPr>
+        <w:t xml:space="preserve">}} </w:t>
       </w:r>
       <w:r>
         <w:rPr>
           <w:sz w:val="16"/>
           <w:szCs w:val="16"/>
         </w:rPr>
-        <w:t>{{teblig}} ile tebliğ olmuştur.</w:t>
+        <w:t>{{</w:t>
+      </w:r>
+      <w:proofErr w:type="spellStart"/>
+      <w:r>
+        <w:rPr>
+          <w:sz w:val="16"/>
+          <w:szCs w:val="16"/>
+        </w:rPr>
+        <w:t>teblig</w:t>
+      </w:r>
+      <w:proofErr w:type="spellEnd"/>
+      <w:r>
+        <w:rPr>
+          <w:sz w:val="16"/>
+          <w:szCs w:val="16"/>
+        </w:rPr>
+        <w:t>}} ile tebliğ olmuştur.</w:t>
       </w:r>
     </w:p>
     <w:p>
@@ -3074,7 +3188,23 @@
           <w:sz w:val="16"/>
           <w:szCs w:val="16"/>
         </w:rPr>
-        <w:t>&lt;&lt;teblig_tarihi_list&gt;&gt;</w:t>
+        <w:t>&lt;&lt;</w:t>
+      </w:r>
+      <w:proofErr w:type="spellStart"/>
+      <w:r>
+        <w:rPr>
+          <w:sz w:val="16"/>
+          <w:szCs w:val="16"/>
+        </w:rPr>
+        <w:t>teblig_tarihi_list</w:t>
+      </w:r>
+      <w:proofErr w:type="spellEnd"/>
+      <w:r>
+        <w:rPr>
+          <w:sz w:val="16"/>
+          <w:szCs w:val="16"/>
+        </w:rPr>
+        <w:t>&gt;&gt;</w:t>
       </w:r>
     </w:p>
     <w:p>
@@ -3158,6 +3288,128 @@
         </w:rPr>
         <w:t>Müşteri gecikmiş bakiyesini ödemediği için ,6361 Sayılı Finansal Kiralama kanununun 31.maddesine istinaden (Sözleşmenin ihlali) tek taraflı fesih hakkımız doğmuştur.</w:t>
       </w:r>
+    </w:p>
+    <w:p>
+      <w:pPr>
+        <w:rPr>
+          <w:sz w:val="18"/>
+          <w:szCs w:val="18"/>
+        </w:rPr>
+      </w:pPr>
+    </w:p>
+    <w:tbl>
+      <w:tblPr>
+        <w:tblW w:w="9360" w:type="dxa"/>
+        <w:tblBorders>
+          <w:top w:val="single" w:sz="4" w:space="0" w:color="auto"/>
+          <w:left w:val="single" w:sz="4" w:space="0" w:color="auto"/>
+          <w:bottom w:val="single" w:sz="4" w:space="0" w:color="auto"/>
+          <w:right w:val="single" w:sz="4" w:space="0" w:color="auto"/>
+          <w:insideH w:val="single" w:sz="4" w:space="0" w:color="auto"/>
+          <w:insideV w:val="single" w:sz="4" w:space="0" w:color="auto"/>
+        </w:tblBorders>
+        <w:tblCellMar>
+          <w:left w:w="10" w:type="dxa"/>
+          <w:right w:w="10" w:type="dxa"/>
+        </w:tblCellMar>
+        <w:tblLook w:val="0000" w:firstRow="0" w:lastRow="0" w:firstColumn="0" w:lastColumn="0" w:noHBand="0" w:noVBand="0"/>
+      </w:tblPr>
+      <w:tblGrid>
+        <w:gridCol w:w="9360"/>
+      </w:tblGrid>
+      <w:tr>
+        <w:tc>
+          <w:tcPr>
+            <w:tcW w:w="4680" w:type="dxa"/>
+            <w:tcBorders>
+              <w:top w:val="none" w:sz="0" w:space="0" w:color="FFFFFF"/>
+              <w:left w:val="none" w:sz="0" w:space="0" w:color="FFFFFF"/>
+              <w:bottom w:val="none" w:sz="0" w:space="0" w:color="FFFFFF"/>
+              <w:right w:val="none" w:sz="0" w:space="0" w:color="FFFFFF"/>
+            </w:tcBorders>
+            <w:tcMar>
+              <w:top w:w="80" w:type="dxa"/>
+              <w:left w:w="120" w:type="dxa"/>
+              <w:bottom w:w="80" w:type="dxa"/>
+              <w:right w:w="120" w:type="dxa"/>
+            </w:tcMar>
+            <w:vAlign w:val="center"/>
+          </w:tcPr>
+          <w:p>
+            <w:pPr>
+              <w:rPr>
+                <w:sz w:val="14"/>
+                <w:szCs w:val="14"/>
+              </w:rPr>
+            </w:pPr>
+            <w:r>
+              <w:rPr>
+                <w:b/>
+                <w:bCs/>
+                <w:color w:val="000000"/>
+                <w:sz w:val="14"/>
+                <w:szCs w:val="14"/>
+              </w:rPr>
+              <w:t>Afşin Merdan</w:t>
+            </w:r>
+          </w:p>
+        </w:tc>
+      </w:tr>
+      <w:tr>
+        <w:trPr>
+          <w:trHeight w:val="17"/>
+        </w:trPr>
+        <w:tc>
+          <w:tcPr>
+            <w:tcW w:w="4680" w:type="dxa"/>
+            <w:tcBorders>
+              <w:top w:val="none" w:sz="0" w:space="0" w:color="FFFFFF"/>
+              <w:left w:val="none" w:sz="0" w:space="0" w:color="FFFFFF"/>
+              <w:bottom w:val="none" w:sz="0" w:space="0" w:color="FFFFFF"/>
+              <w:right w:val="none" w:sz="0" w:space="0" w:color="FFFFFF"/>
+            </w:tcBorders>
+            <w:tcMar>
+              <w:top w:w="80" w:type="dxa"/>
+              <w:left w:w="120" w:type="dxa"/>
+              <w:bottom w:w="80" w:type="dxa"/>
+              <w:right w:w="120" w:type="dxa"/>
+            </w:tcMar>
+            <w:vAlign w:val="center"/>
+          </w:tcPr>
+          <w:p>
+            <w:pPr>
+              <w:rPr>
+                <w:sz w:val="14"/>
+                <w:szCs w:val="14"/>
+              </w:rPr>
+            </w:pPr>
+            <w:r>
+              <w:rPr>
+                <w:color w:val="000000"/>
+                <w:sz w:val="14"/>
+                <w:szCs w:val="14"/>
+              </w:rPr>
+              <w:t>Operasyon ve Risk İzleme Müdürü</w:t>
+            </w:r>
+          </w:p>
+        </w:tc>
+      </w:tr>
+    </w:tbl>
+    <w:p>
+      <w:pPr>
+        <w:rPr>
+          <w:sz w:val="18"/>
+          <w:szCs w:val="18"/>
+        </w:rPr>
+      </w:pPr>
+    </w:p>
+    <w:p>
+      <w:pPr>
+        <w:rPr>
+          <w:sz w:val="18"/>
+          <w:szCs w:val="18"/>
+        </w:rPr>
+      </w:pPr>
     </w:p>
     <w:p>
       <w:pPr>
@@ -3200,7 +3452,23 @@
           <w:sz w:val="16"/>
           <w:szCs w:val="16"/>
         </w:rPr>
-        <w:t>{{pb}}</w:t>
+        <w:t>{{</w:t>
+      </w:r>
+      <w:proofErr w:type="spellStart"/>
+      <w:r>
+        <w:rPr>
+          <w:sz w:val="16"/>
+          <w:szCs w:val="16"/>
+        </w:rPr>
+        <w:t>pb</w:t>
+      </w:r>
+      <w:proofErr w:type="spellEnd"/>
+      <w:r>
+        <w:rPr>
+          <w:sz w:val="16"/>
+          <w:szCs w:val="16"/>
+        </w:rPr>
+        <w:t>}}</w:t>
       </w:r>
       <w:r>
         <w:rPr>
@@ -3214,7 +3482,7 @@
     <w:p/>
     <w:tbl>
       <w:tblPr>
-        <w:tblW w:w="9360" w:type="dxa"/>
+        <w:tblW w:w="4680" w:type="dxa"/>
         <w:tblBorders>
           <w:top w:val="single" w:sz="4" w:space="0" w:color="auto"/>
           <w:left w:val="single" w:sz="4" w:space="0" w:color="auto"/>
@@ -3231,7 +3499,6 @@
       </w:tblPr>
       <w:tblGrid>
         <w:gridCol w:w="4680"/>
-        <w:gridCol w:w="4680"/>
       </w:tblGrid>
       <w:tr>
         <w:tc>
@@ -3267,42 +3534,6 @@
                 <w:szCs w:val="14"/>
               </w:rPr>
               <w:t>RIDVAN ÇABUKEL</w:t>
-            </w:r>
-          </w:p>
-        </w:tc>
-        <w:tc>
-          <w:tcPr>
-            <w:tcW w:w="4680" w:type="dxa"/>
-            <w:tcBorders>
-              <w:top w:val="none" w:sz="0" w:space="0" w:color="FFFFFF"/>
-              <w:left w:val="none" w:sz="0" w:space="0" w:color="FFFFFF"/>
-              <w:bottom w:val="none" w:sz="0" w:space="0" w:color="FFFFFF"/>
-              <w:right w:val="none" w:sz="0" w:space="0" w:color="FFFFFF"/>
-            </w:tcBorders>
-            <w:tcMar>
-              <w:top w:w="80" w:type="dxa"/>
-              <w:left w:w="120" w:type="dxa"/>
-              <w:bottom w:w="80" w:type="dxa"/>
-              <w:right w:w="120" w:type="dxa"/>
-            </w:tcMar>
-            <w:vAlign w:val="center"/>
-          </w:tcPr>
-          <w:p>
-            <w:pPr>
-              <w:rPr>
-                <w:sz w:val="14"/>
-                <w:szCs w:val="14"/>
-              </w:rPr>
-            </w:pPr>
-            <w:r>
-              <w:rPr>
-                <w:b/>
-                <w:bCs/>
-                <w:color w:val="000000"/>
-                <w:sz w:val="14"/>
-                <w:szCs w:val="14"/>
-              </w:rPr>
-              <w:t>Selda Ergön</w:t>
             </w:r>
           </w:p>
         </w:tc>
@@ -3342,40 +3573,6 @@
                 <w:szCs w:val="14"/>
               </w:rPr>
               <w:t>Genel Müdür</w:t>
-            </w:r>
-          </w:p>
-        </w:tc>
-        <w:tc>
-          <w:tcPr>
-            <w:tcW w:w="4680" w:type="dxa"/>
-            <w:tcBorders>
-              <w:top w:val="none" w:sz="0" w:space="0" w:color="FFFFFF"/>
-              <w:left w:val="none" w:sz="0" w:space="0" w:color="FFFFFF"/>
-              <w:bottom w:val="none" w:sz="0" w:space="0" w:color="FFFFFF"/>
-              <w:right w:val="none" w:sz="0" w:space="0" w:color="FFFFFF"/>
-            </w:tcBorders>
-            <w:tcMar>
-              <w:top w:w="80" w:type="dxa"/>
-              <w:left w:w="120" w:type="dxa"/>
-              <w:bottom w:w="80" w:type="dxa"/>
-              <w:right w:w="120" w:type="dxa"/>
-            </w:tcMar>
-            <w:vAlign w:val="center"/>
-          </w:tcPr>
-          <w:p>
-            <w:pPr>
-              <w:rPr>
-                <w:sz w:val="14"/>
-                <w:szCs w:val="14"/>
-              </w:rPr>
-            </w:pPr>
-            <w:r>
-              <w:rPr>
-                <w:color w:val="000000"/>
-                <w:sz w:val="14"/>
-                <w:szCs w:val="14"/>
-              </w:rPr>
-              <w:t>Kredi Takip ve Risk İzleme Mdr.Yrd.</w:t>
             </w:r>
           </w:p>
         </w:tc>
@@ -3919,6 +4116,7 @@
   <w:style w:type="paragraph" w:default="1" w:styleId="Normal">
     <w:name w:val="Normal"/>
     <w:qFormat/>
+    <w:rsid w:val="00455404"/>
   </w:style>
   <w:style w:type="paragraph" w:styleId="Balk1">
     <w:name w:val="heading 1"/>
@@ -4007,7 +4205,6 @@
   <w:style w:type="character" w:default="1" w:styleId="VarsaylanParagrafYazTipi">
     <w:name w:val="Default Paragraph Font"/>
     <w:uiPriority w:val="1"/>
-    <w:semiHidden/>
     <w:unhideWhenUsed/>
   </w:style>
   <w:style w:type="table" w:default="1" w:styleId="NormalTablo">

</xml_diff>